<commit_message>
updated the references (fixing typos)
</commit_message>
<xml_diff>
--- a/03_manuscript/manuscript_edited.docx
+++ b/03_manuscript/manuscript_edited.docx
@@ -152,23 +152,7 @@
         <w:spacing w:before="0" w:after="0"/>
       </w:pPr>
       <w:r>
-        <w:t xml:space="preserve">The authors made the following contributions. Kelly </w:t>
-      </w:r>
-      <w:proofErr w:type="spellStart"/>
-      <w:r>
-        <w:t>Cuccolo</w:t>
-      </w:r>
-      <w:proofErr w:type="spellEnd"/>
-      <w:r>
-        <w:t xml:space="preserve">: Conceptualization, Writing - Original Draft Preparation, Writing - Review &amp; Editing; Jordan </w:t>
-      </w:r>
-      <w:proofErr w:type="spellStart"/>
-      <w:r>
-        <w:t>Wagge</w:t>
-      </w:r>
-      <w:proofErr w:type="spellEnd"/>
-      <w:r>
-        <w:t>: Conceptualization, Writing - Original Draft Preparation, Writing - Review &amp; Editing; John E. Edlund: Conceptualization, Writing - Original Draft Preparation, Writing - Review &amp; Editing; Erin M. Buchanan: Conceptualization, Writing - Original Draft Preparation, Writing - Review &amp; Editing, Analysis, Visualization.</w:t>
+        <w:t>The authors made the following contributions. Kelly Cuccolo: Conceptualization, Writing - Original Draft Preparation, Writing - Review &amp; Editing; Jordan Wagge: Conceptualization, Writing - Original Draft Preparation, Writing - Review &amp; Editing; John E. Edlund: Conceptualization, Writing - Original Draft Preparation, Writing - Review &amp; Editing; Erin M. Buchanan: Conceptualization, Writing - Original Draft Preparation, Writing - Review &amp; Editing, Analysis, Visualization.</w:t>
       </w:r>
     </w:p>
     <w:p>
@@ -279,31 +263,7 @@
         <w:spacing w:before="0" w:after="0"/>
       </w:pPr>
       <w:r>
-        <w:t>Scientific collaboration (i.e., co-authorship) has been increasing in many fields of study, such as biomedical sciences (Papatheodorou et al., 2008), medicine (Weeks et al., 2004), and psychology (</w:t>
-      </w:r>
-      <w:proofErr w:type="spellStart"/>
-      <w:r>
-        <w:t>Zafrunnisha</w:t>
-      </w:r>
-      <w:proofErr w:type="spellEnd"/>
-      <w:r>
-        <w:t xml:space="preserve"> &amp; Reddy, 2010). Notably, scientific collaboration is one factor that may positively influence article metrics (e.g., citation rates, Larivière et al., 2015; </w:t>
-      </w:r>
-      <w:proofErr w:type="spellStart"/>
-      <w:r>
-        <w:t>Wuchty</w:t>
-      </w:r>
-      <w:proofErr w:type="spellEnd"/>
-      <w:r>
-        <w:t xml:space="preserve"> et al., 2007), although the extent of this effect may vary by field (e.g., physics, Hinnant et al., 2012). Within scientific collaboration, additional characteristics of the authorship team may exert influence on these metrics. Authorship team diversity is a key factor to be considered when looking at the impact of collaboration on article metrics. Author diversity, broadly speaking, has been associated with positive outcomes such as publication in high-impact factor journals, rates of citations, and funding (Freeman &amp; Huang, 2015; Nichols, 2014). It is important to note that author diversity can be conceptualized along a continuum of factors such as gender, physical location (e.g., United States, Brazil), institutional affiliation, discipline, and rank. Evidence suggests the impact of international collaboration, rank, and gender on article metrics in fields such as sport science research (Wang et al., 2015), physics (Hinnant et al., 2012), and psychology (Geraci et al., 2015), respectively, but a gap exists in which the accumulation of these factors over time and across disciplines has not yet been addressed. As such, this project aims to understand: 1a.) What is the pattern of team size distribution within various disciplines over time, 1b.) is team size related to article </w:t>
-      </w:r>
-      <w:proofErr w:type="gramStart"/>
-      <w:r>
-        <w:t>impact?,</w:t>
-      </w:r>
-      <w:proofErr w:type="gramEnd"/>
-      <w:r>
-        <w:t xml:space="preserve"> and 2.) What characteristics of team composition have the greatest influence on article metrics?</w:t>
+        <w:t>Scientific collaboration (i.e., co-authorship) has been increasing in many fields of study, such as biomedical sciences (Papatheodorou et al., 2008), medicine (Weeks et al., 2004), and psychology (Zafrunnisha &amp; Reddy, 2010). Notably, scientific collaboration is one factor that may positively influence article metrics (e.g., citation rates, Larivière et al., 2015; Wuchty et al., 2007), although the extent of this effect may vary by field (e.g., physics, Hinnant et al., 2012). Within scientific collaboration, additional characteristics of the authorship team may exert influence on these metrics. Authorship team diversity is a key factor to be considered when looking at the impact of collaboration on article metrics. Author diversity, broadly speaking, has been associated with positive outcomes such as publication in high-impact factor journals, rates of citations, and funding (Freeman &amp; Huang, 2015; Nichols, 2014). It is important to note that author diversity can be conceptualized along a continuum of factors such as gender, physical location (e.g., United States, Brazil), institutional affiliation, discipline, and rank. Evidence suggests the impact of international collaboration, rank, and gender on article metrics in fields such as sport science research (Wang et al., 2015), physics (Hinnant et al., 2012), and psychology (Geraci et al., 2015), respectively, but a gap exists in which the accumulation of these factors over time and across disciplines has not yet been addressed. As such, this project aims to understand: 1a.) What is the pattern of team size distribution within various disciplines over time, 1b.) is team size related to article impact?, and 2.) What characteristics of team composition have the greatest influence on article metrics?</w:t>
       </w:r>
     </w:p>
     <w:p>
@@ -333,31 +293,7 @@
       </w:r>
       <w:r>
         <w:lastRenderedPageBreak/>
-        <w:t>initiatives, calls, and funding opportunities for collaborative research from both private and public/government sectors (</w:t>
-      </w:r>
-      <w:proofErr w:type="spellStart"/>
-      <w:r>
-        <w:t>Wuchty</w:t>
-      </w:r>
-      <w:proofErr w:type="spellEnd"/>
-      <w:r>
-        <w:t xml:space="preserve"> et al., 2007). Further, some argue that scientific collaboration and large interdisciplinary/international teams are needed to effectively address modern societal questions and problems (Samarasekera, 2009). Indeed, team size (i.e., number of co-authors) has been increasing in recent years across various disciplines (Papatheodorou et al., 2008), including science and engineering, social sciences, and arts and humanities (</w:t>
-      </w:r>
-      <w:proofErr w:type="spellStart"/>
-      <w:r>
-        <w:t>Wuchty</w:t>
-      </w:r>
-      <w:proofErr w:type="spellEnd"/>
-      <w:r>
-        <w:t xml:space="preserve"> et al., 2007). While some research suggests an overall trend toward collaboration (</w:t>
-      </w:r>
-      <w:proofErr w:type="spellStart"/>
-      <w:r>
-        <w:t>Wuchty</w:t>
-      </w:r>
-      <w:proofErr w:type="spellEnd"/>
-      <w:r>
-        <w:t xml:space="preserve"> et al., 2007), these findings do not appear to apply to all disciplines equally.</w:t>
+        <w:t>initiatives, calls, and funding opportunities for collaborative research from both private and public/government sectors (Wuchty et al., 2007). Further, some argue that scientific collaboration and large interdisciplinary/international teams are needed to effectively address modern societal questions and problems (Samarasekera, 2009). Indeed, team size (i.e., number of co-authors) has been increasing in recent years across various disciplines (Papatheodorou et al., 2008), including science and engineering, social sciences, and arts and humanities (Wuchty et al., 2007). While some research suggests an overall trend toward collaboration (Wuchty et al., 2007), these findings do not appear to apply to all disciplines equally.</w:t>
       </w:r>
     </w:p>
     <w:p>
@@ -424,41 +360,17 @@
         <w:spacing w:before="0" w:after="0"/>
       </w:pPr>
       <w:r>
-        <w:t xml:space="preserve">Although several disciplines report increases in co-authorship over the past several decades, it is important to ask the question of who </w:t>
-      </w:r>
-      <w:proofErr w:type="gramStart"/>
-      <w:r>
-        <w:t>is publishing</w:t>
-      </w:r>
-      <w:proofErr w:type="gramEnd"/>
-      <w:r>
-        <w:t xml:space="preserve">, and with whom. </w:t>
+        <w:t xml:space="preserve">Although several disciplines report increases in co-authorship over the past several decades, it is important to ask the question of who is publishing, and with whom. </w:t>
       </w:r>
       <w:r>
         <w:t>Despite</w:t>
       </w:r>
       <w:r>
-        <w:t xml:space="preserve"> increases in women’s representation in academia, women still are underrepresented when it comes to publishing co- and solo-authored papers (</w:t>
-      </w:r>
-      <w:proofErr w:type="spellStart"/>
-      <w:r>
-        <w:t>Jagsi</w:t>
-      </w:r>
-      <w:proofErr w:type="spellEnd"/>
-      <w:r>
-        <w:t xml:space="preserve"> et al., 2006). In addition to authoring a smaller proportion of published work, research suggests women are also less likely to hold prominent authorship positions (Rigg et al., 2012; West et al., 2013). For example, women are </w:t>
+        <w:t xml:space="preserve"> increases in women’s representation in academia, women still are underrepresented when it comes to publishing co- and solo-authored papers (Jagsi et al., 2006). In addition to authoring a smaller proportion of published work, research suggests women are also less likely to hold prominent authorship positions (Rigg et al., 2012; West et al., 2013). For example, women are </w:t>
       </w:r>
       <w:r>
         <w:lastRenderedPageBreak/>
-        <w:t xml:space="preserve">underrepresented regarding publishing articles in specific areas of medicine (Cushman, 2022; </w:t>
-      </w:r>
-      <w:proofErr w:type="spellStart"/>
-      <w:r>
-        <w:t>Süßenbacher</w:t>
-      </w:r>
-      <w:proofErr w:type="spellEnd"/>
-      <w:r>
-        <w:t xml:space="preserve"> et al., 2017), STEM fields (e.g., mathematics, Mihaljević-Brandt et al., 2016), and social sciences (Bonham &amp; Stefan, 2017; Mihaljević-Brandt et al., 2016), although the extent of these differences vary by subfield (e.g., computational biology, as compared to biology in general, Bonham &amp; Stefan, 2017). Interestingly, women are less likely to collaborate with previous co-authors compared to men (Zeng et al., 2016); although it is not clear why this is the case, it could have important implications for their careers as novel teams tend to produce higher-impact work (Katzenbach &amp; Smith, 2003).</w:t>
+        <w:t>underrepresented regarding publishing articles in specific areas of medicine (Cushman, 2022; Süßenbacher et al., 2017), STEM fields (e.g., mathematics, Mihaljević-Brandt et al., 2016), and social sciences (Bonham &amp; Stefan, 2017; Mihaljević-Brandt et al., 2016), although the extent of these differences vary by subfield (e.g., computational biology, as compared to biology in general, Bonham &amp; Stefan, 2017). Interestingly, women are less likely to collaborate with previous co-authors compared to men (Zeng et al., 2016); although it is not clear why this is the case, it could have important implications for their careers as novel teams tend to produce higher-impact work (Katzenbach &amp; Smith, 2003).</w:t>
       </w:r>
     </w:p>
     <w:p>
@@ -647,15 +559,7 @@
         <w:spacing w:before="0" w:after="0"/>
       </w:pPr>
       <w:r>
-        <w:t xml:space="preserve">Collaboration involving </w:t>
-      </w:r>
-      <w:proofErr w:type="gramStart"/>
-      <w:r>
-        <w:t>those outside</w:t>
-      </w:r>
-      <w:proofErr w:type="gramEnd"/>
-      <w:r>
-        <w:t xml:space="preserve"> of one’s home institution and country may significantly impact article metrics, which may be one reason for the increasing rates of international collaboration. For instance, for UK institutions indexed in the Science Citation Index between 1981 and 1994, collaboration within one’s home university or country resulted in a small increase in average impact (0.75 citations) whereas collaboration outside of one’s home country resulted in a more moderate increase </w:t>
+        <w:t xml:space="preserve">Collaboration involving those outside of one’s home institution and country may significantly impact article metrics, which may be one reason for the increasing rates of international collaboration. For instance, for UK institutions indexed in the Science Citation Index between 1981 and 1994, collaboration within one’s home university or country resulted in a small increase in average impact (0.75 citations) whereas collaboration outside of one’s home country resulted in a more moderate increase </w:t>
       </w:r>
       <w:r>
         <w:t>(</w:t>
@@ -697,10 +601,7 @@
         <w:t>However, this trend may not be consistent across fields, journals, and/or countries, and warrants further investigation (e.g., physics,</w:t>
       </w:r>
       <w:r>
-        <w:t xml:space="preserve"> </w:t>
-      </w:r>
-      <w:r>
-        <w:t>Hinnant et al., 2012;</w:t>
+        <w:t xml:space="preserve"> Hinnant et al., 2012;</w:t>
       </w:r>
       <w:r>
         <w:t xml:space="preserve"> Rousseau &amp; Ding, 2016). For example, international collaboration generally increases citation rates in the field of sports science, but the extent of this effect varies by which countries are collaborating (Wang et al., 2015). Collaboration between the United States and Canada, for instance, produced a mean citation rate greater than the domestic mean observed citation rate of each country respectively, whereas collaboration between the United Kingdom and Greece produced a mean citation rate that was lower than the domestic mean observed citation rate of each country respectively. Furthermore, when examining the benefits of international collaboration on citation count for </w:t>
@@ -775,29 +676,8 @@
         <w:pStyle w:val="BodyText"/>
         <w:spacing w:before="0" w:after="0"/>
       </w:pPr>
-      <w:proofErr w:type="gramStart"/>
-      <w:r>
-        <w:t>The majority of</w:t>
-      </w:r>
-      <w:proofErr w:type="gramEnd"/>
-      <w:r>
-        <w:t xml:space="preserve"> work examining team characteristics and article metrics have focused on a specific field (Hinnant et al., 2012), and/or a limited/restricted number of team characteristics (e.g., size, </w:t>
-      </w:r>
-      <w:proofErr w:type="spellStart"/>
-      <w:r>
-        <w:t>Wuchty</w:t>
-      </w:r>
-      <w:proofErr w:type="spellEnd"/>
-      <w:r>
-        <w:t xml:space="preserve"> et al., 2007). Empirical data comparing the impact of diverse/multiple team characteristics on article metrics within a given field is limited (Grossman, 2002; Hinnant et al., 2012; Nabout et al., 2015; Wang et al., 2015; Weeks et al., 2004). Along a similar vein, empirical data comparing the impact of team characteristics on article metrics across fields is also limited (for notable exceptions, Larivière et al., 2015; </w:t>
-      </w:r>
-      <w:proofErr w:type="spellStart"/>
-      <w:r>
-        <w:t>Wuchty</w:t>
-      </w:r>
-      <w:proofErr w:type="spellEnd"/>
-      <w:r>
-        <w:t xml:space="preserve"> et al., 2007). Comparing outcomes within and across fields can allow for an increased understanding of these fields’ scientific culture. Practically, understanding factors associated with an article’s impact can be important for researchers’ outreach, as well as planning for the job market and tenure review.</w:t>
+      <w:r>
+        <w:t>The majority of work examining team characteristics and article metrics have focused on a specific field (Hinnant et al., 2012), and/or a limited/restricted number of team characteristics (e.g., size, Wuchty et al., 2007). Empirical data comparing the impact of diverse/multiple team characteristics on article metrics within a given field is limited (Grossman, 2002; Hinnant et al., 2012; Nabout et al., 2015; Wang et al., 2015; Weeks et al., 2004). Along a similar vein, empirical data comparing the impact of team characteristics on article metrics across fields is also limited (for notable exceptions, Larivière et al., 2015; Wuchty et al., 2007). Comparing outcomes within and across fields can allow for an increased understanding of these fields’ scientific culture. Practically, understanding factors associated with an article’s impact can be important for researchers’ outreach, as well as planning for the job market and tenure review.</w:t>
       </w:r>
     </w:p>
     <w:p>
@@ -826,21 +706,8 @@
         <w:pStyle w:val="FirstParagraph"/>
         <w:spacing w:before="0" w:after="0"/>
       </w:pPr>
-      <w:proofErr w:type="gramStart"/>
-      <w:r>
-        <w:t>All of</w:t>
-      </w:r>
-      <w:proofErr w:type="gramEnd"/>
-      <w:r>
-        <w:t xml:space="preserve"> the data for this manuscript is drawn from peer-reviewed journals. </w:t>
-      </w:r>
-      <w:proofErr w:type="gramStart"/>
-      <w:r>
-        <w:t>All of</w:t>
-      </w:r>
-      <w:proofErr w:type="gramEnd"/>
-      <w:r>
-        <w:t xml:space="preserve"> the extracted meta-data from the individual publications are de-identified in the database. As such, </w:t>
+      <w:r>
+        <w:t xml:space="preserve">All of the data for this manuscript is drawn from peer-reviewed journals. All of the extracted meta-data from the individual publications are de-identified in the database. As such, </w:t>
       </w:r>
       <w:r>
         <w:lastRenderedPageBreak/>
@@ -978,15 +845,7 @@
         <w:t>above-mentioned</w:t>
       </w:r>
       <w:r>
-        <w:t xml:space="preserve"> variables. Only journal articles from this </w:t>
-      </w:r>
-      <w:proofErr w:type="gramStart"/>
-      <w:r>
-        <w:t>time period</w:t>
-      </w:r>
-      <w:proofErr w:type="gramEnd"/>
-      <w:r>
-        <w:t xml:space="preserve"> will be included sampled at a rate of 25% of eligible articles. We will include the analysis date to indicate the data available at the time of analysis. We originally included all articles from 1970 and forward. Due to computational constraints, we randomly sampled 25% of eligible articles during this time span to constrain the run time of our code and the memory necessary to calculate </w:t>
+        <w:t xml:space="preserve"> variables. Only journal articles from this time period will be included sampled at a rate of 25% of eligible articles. We will include the analysis date to indicate the data available at the time of analysis. We originally included all articles from 1970 and forward. Due to computational constraints, we randomly sampled 25% of eligible articles during this time span to constrain the run time of our code and the memory necessary to calculate </w:t>
       </w:r>
       <w:r>
         <w:rPr>
@@ -1052,7 +911,6 @@
       <w:r>
         <w:t xml:space="preserve">Given the large size of the Scopus dataset, all analyses are expected to achieve the required 95% power. Analyses using the </w:t>
       </w:r>
-      <w:proofErr w:type="spellStart"/>
       <w:r>
         <w:rPr>
           <w:i/>
@@ -1060,25 +918,8 @@
         </w:rPr>
         <w:t>pwr</w:t>
       </w:r>
-      <w:proofErr w:type="spellEnd"/>
-      <w:r>
-        <w:t xml:space="preserve"> library (</w:t>
-      </w:r>
-      <w:proofErr w:type="spellStart"/>
-      <w:r>
-        <w:t>Champely</w:t>
-      </w:r>
-      <w:proofErr w:type="spellEnd"/>
-      <w:r>
-        <w:t xml:space="preserve"> et al., 2017) indicated that planned regressions </w:t>
-      </w:r>
-      <w:proofErr w:type="gramStart"/>
-      <w:r>
-        <w:t>have the ability to</w:t>
-      </w:r>
-      <w:proofErr w:type="gramEnd"/>
-      <w:r>
-        <w:t xml:space="preserve"> detect effects at </w:t>
+      <w:r>
+        <w:t xml:space="preserve"> library (Champely et al., 2017) indicated that planned regressions have the ability to detect effects at </w:t>
       </w:r>
       <m:oMath>
         <m:sSup>
@@ -1203,7 +1044,6 @@
       <w:r>
         <w:t xml:space="preserve">, which includes an update due to deviations from the original plan. The code used to create this manuscript with the </w:t>
       </w:r>
-      <w:proofErr w:type="spellStart"/>
       <w:r>
         <w:rPr>
           <w:i/>
@@ -1211,7 +1051,6 @@
         </w:rPr>
         <w:t>papaja</w:t>
       </w:r>
-      <w:proofErr w:type="spellEnd"/>
       <w:r>
         <w:t xml:space="preserve"> package (Aust et al., 2022) can be found online as well.</w:t>
       </w:r>
@@ -1266,23 +1105,7 @@
         <w:t>r</w:t>
       </w:r>
       <w:r>
-        <w:t xml:space="preserve"> &gt; .90, we planned to note these correlations and only use one of the proposed variables. No values reached </w:t>
-      </w:r>
-      <w:proofErr w:type="gramStart"/>
-      <w:r>
-        <w:t>this criteria</w:t>
-      </w:r>
-      <w:proofErr w:type="gramEnd"/>
-      <w:r>
-        <w:t xml:space="preserve"> for the five subject areas. The size of the dataset implied the assumption of normality. In our analyses, a linear trend was the </w:t>
-      </w:r>
-      <w:proofErr w:type="gramStart"/>
-      <w:r>
-        <w:t>main focus</w:t>
-      </w:r>
-      <w:proofErr w:type="gramEnd"/>
-      <w:r>
-        <w:t xml:space="preserve"> of interest, and we did not note any non-linear trends. Last, nearly all scatter plots indicated heteroscedasticity. Please see Appendix A for further details.</w:t>
+        <w:t xml:space="preserve"> &gt; .90, we planned to note these correlations and only use one of the proposed variables. No values reached this criteria for the five subject areas. The size of the dataset implied the assumption of normality. In our analyses, a linear trend was the main focus of interest, and we did not note any non-linear trends. Last, nearly all scatter plots indicated heteroscedasticity. Please see Appendix A for further details.</w:t>
       </w:r>
     </w:p>
     <w:p>
@@ -1386,7 +1209,6 @@
       <w:r>
         <w:t xml:space="preserve">All analyses were performed using </w:t>
       </w:r>
-      <w:proofErr w:type="spellStart"/>
       <w:r>
         <w:rPr>
           <w:i/>
@@ -1394,25 +1216,15 @@
         </w:rPr>
         <w:t>pyspark</w:t>
       </w:r>
-      <w:proofErr w:type="spellEnd"/>
       <w:r>
         <w:t xml:space="preserve"> (</w:t>
       </w:r>
-      <w:proofErr w:type="spellStart"/>
       <w:r>
         <w:rPr>
           <w:i/>
           <w:iCs/>
         </w:rPr>
-        <w:t>PySpark</w:t>
-      </w:r>
-      <w:proofErr w:type="spellEnd"/>
-      <w:r>
-        <w:rPr>
-          <w:i/>
-          <w:iCs/>
-        </w:rPr>
-        <w:t xml:space="preserve"> Documentation</w:t>
+        <w:t>PySpark Documentation</w:t>
       </w:r>
       <w:r>
         <w:rPr>
@@ -1421,21 +1233,12 @@
         </w:rPr>
         <w:t xml:space="preserve"> </w:t>
       </w:r>
-      <w:proofErr w:type="spellStart"/>
       <w:r>
         <w:rPr>
           <w:i/>
           <w:iCs/>
         </w:rPr>
-        <w:t>PySpark</w:t>
-      </w:r>
-      <w:proofErr w:type="spellEnd"/>
-      <w:r>
-        <w:rPr>
-          <w:i/>
-          <w:iCs/>
-        </w:rPr>
-        <w:t xml:space="preserve"> 3.3.0 Documentation</w:t>
+        <w:t>PySpark 3.3.0 Documentation</w:t>
       </w:r>
       <w:r>
         <w:t xml:space="preserve">, n.d.) within the Databricks system. Visualization and presentation of analyses were included using </w:t>
@@ -1450,7 +1253,6 @@
       <w:r>
         <w:t xml:space="preserve"> (R Core Team, 2022), </w:t>
       </w:r>
-      <w:proofErr w:type="spellStart"/>
       <w:r>
         <w:rPr>
           <w:i/>
@@ -1458,11 +1260,9 @@
         </w:rPr>
         <w:t>dplyr</w:t>
       </w:r>
-      <w:proofErr w:type="spellEnd"/>
       <w:r>
         <w:t xml:space="preserve"> (Wickham et al., 2020), </w:t>
       </w:r>
-      <w:proofErr w:type="spellStart"/>
       <w:r>
         <w:rPr>
           <w:i/>
@@ -1470,11 +1270,9 @@
         </w:rPr>
         <w:t>rio</w:t>
       </w:r>
-      <w:proofErr w:type="spellEnd"/>
       <w:r>
         <w:t xml:space="preserve"> (Becker et al., 2021), </w:t>
       </w:r>
-      <w:proofErr w:type="spellStart"/>
       <w:r>
         <w:rPr>
           <w:i/>
@@ -1482,7 +1280,6 @@
         </w:rPr>
         <w:t>tidyr</w:t>
       </w:r>
-      <w:proofErr w:type="spellEnd"/>
       <w:r>
         <w:t xml:space="preserve"> (Wickham, 2020), </w:t>
       </w:r>
@@ -1544,13 +1341,8 @@
         <w:pStyle w:val="BodyText"/>
         <w:spacing w:before="0" w:after="0"/>
       </w:pPr>
-      <w:proofErr w:type="gramStart"/>
-      <w:r>
-        <w:t>In order to</w:t>
-      </w:r>
-      <w:proofErr w:type="gramEnd"/>
-      <w:r>
-        <w:t xml:space="preserve"> determine if team sizes change overall across time, we used a linear model of team size predicted by year of publication in which each article was only represented once, regardless of discipline. We examined if the confidence interval of the slope parameter was different from zero to determine if the predictor was significant. Last, we calculated each subject area’s slope and confidence interval using a linear model of team size predicted by year of publication. Again, we provide these slopes in a visualization for readers to examine with no official </w:t>
+      <w:r>
+        <w:t xml:space="preserve">In order to determine if team sizes change overall across time, we used a linear model of team size predicted by year of publication in which each article was only represented once, regardless of discipline. We examined if the confidence interval of the slope parameter was different from zero to determine if the predictor was significant. Last, we calculated each subject area’s slope and confidence interval using a linear model of team size predicted by year of publication. Again, we provide these slopes in a visualization for readers to examine with no official </w:t>
       </w:r>
       <w:r>
         <w:rPr>
@@ -1562,7 +1354,6 @@
       <w:r>
         <w:t xml:space="preserve"> comparison. While a multilevel model would allow us to embed all disciplines within one model, no </w:t>
       </w:r>
-      <w:proofErr w:type="spellStart"/>
       <w:r>
         <w:rPr>
           <w:i/>
@@ -1570,7 +1361,6 @@
         </w:rPr>
         <w:t>pyspark</w:t>
       </w:r>
-      <w:proofErr w:type="spellEnd"/>
       <w:r>
         <w:t xml:space="preserve"> multilevel model implementation exists to model data at this scale.</w:t>
       </w:r>
@@ -1968,15 +1758,7 @@
         <w:t>Figure</w:t>
       </w:r>
       <w:r>
-        <w:t xml:space="preserve"> 2. Boxplot of citation counts by subject area. The boxplot represents the median (middle bar), the interquartile range (box), and the mean (dot) for overall citations and </w:t>
-      </w:r>
-      <w:proofErr w:type="gramStart"/>
-      <w:r>
-        <w:t>five year</w:t>
-      </w:r>
-      <w:proofErr w:type="gramEnd"/>
-      <w:r>
-        <w:t xml:space="preserve"> citation count. The plot was capped at 60 citations for visualization purposes. The size of the mean point represents the sample size of the number of articles used within the calculation. The size of the box represents the standard deviation of the mean for citation count (i.e., larger boxes indicate more variance in the citation counts).</w:t>
+        <w:t xml:space="preserve"> 2. Boxplot of citation counts by subject area. The boxplot represents the median (middle bar), the interquartile range (box), and the mean (dot) for overall citations and five year citation count. The plot was capped at 60 citations for visualization purposes. The size of the mean point represents the sample size of the number of articles used within the calculation. The size of the box represents the standard deviation of the mean for citation count (i.e., larger boxes indicate more variance in the citation counts).</w:t>
       </w:r>
     </w:p>
     <w:p>
@@ -2014,15 +1796,7 @@
         <w:t>b</w:t>
       </w:r>
       <w:r>
-        <w:t xml:space="preserve"> = 0.12, 95% CI [0.12, 0.13]. </w:t>
-      </w:r>
-      <w:proofErr w:type="gramStart"/>
-      <w:r>
-        <w:t>Five year</w:t>
-      </w:r>
-      <w:proofErr w:type="gramEnd"/>
-      <w:r>
-        <w:t xml:space="preserve"> citations had a similar result, </w:t>
+        <w:t xml:space="preserve"> = 0.12, 95% CI [0.12, 0.13]. Five year citations had a similar result, </w:t>
       </w:r>
       <w:r>
         <w:rPr>
@@ -2231,15 +2005,7 @@
         <w:t>Figure</w:t>
       </w:r>
       <w:r>
-        <w:t xml:space="preserve"> 4. Author variable coefficients (top) and effect sizes (bottom) predicting citation counts and </w:t>
-      </w:r>
-      <w:proofErr w:type="gramStart"/>
-      <w:r>
-        <w:t>five year</w:t>
-      </w:r>
-      <w:proofErr w:type="gramEnd"/>
-      <w:r>
-        <w:t xml:space="preserve"> citation counts. 95% confidence intervals are displayed but are very narrow due to large sample size. Appendix A includes all exact values for reference.</w:t>
+        <w:t xml:space="preserve"> 4. Author variable coefficients (top) and effect sizes (bottom) predicting citation counts and five year citation counts. 95% confidence intervals are displayed but are very narrow due to large sample size. Appendix A includes all exact values for reference.</w:t>
       </w:r>
     </w:p>
     <w:p>
@@ -2314,15 +2080,7 @@
         <w:t>Country and Institution</w:t>
       </w:r>
       <w:r>
-        <w:t xml:space="preserve">. Country and institution </w:t>
-      </w:r>
-      <w:proofErr w:type="gramStart"/>
-      <w:r>
-        <w:t>counts</w:t>
-      </w:r>
-      <w:proofErr w:type="gramEnd"/>
-      <w:r>
-        <w:t xml:space="preserve"> both increased the number of citations. These effects were always larger for the overall citations than the five-year citation counts; however, the effect sizes were again always larger for five-year citation models than overall citation models.</w:t>
+        <w:t>. Country and institution counts both increased the number of citations. These effects were always larger for the overall citations than the five-year citation counts; however, the effect sizes were again always larger for five-year citation models than overall citation models.</w:t>
       </w:r>
     </w:p>
     <w:p>
@@ -2357,15 +2115,7 @@
         <w:t>h</w:t>
       </w:r>
       <w:r>
-        <w:t xml:space="preserve">-index effects </w:t>
-      </w:r>
-      <w:proofErr w:type="gramStart"/>
-      <w:r>
-        <w:t>were</w:t>
-      </w:r>
-      <w:proofErr w:type="gramEnd"/>
-      <w:r>
-        <w:t xml:space="preserve"> positive with larger effects for no-self citations versus including self-citations and first author versus last author. Multidisciplinary papers and the social sciences also tended to have the largest increase in citation counts when authors with higher </w:t>
+        <w:t xml:space="preserve">-index effects were positive with larger effects for no-self citations versus including self-citations and first author versus last author. Multidisciplinary papers and the social sciences also tended to have the largest increase in citation counts when authors with higher </w:t>
       </w:r>
       <w:r>
         <w:rPr>
@@ -2447,15 +2197,7 @@
         <w:t>Figure</w:t>
       </w:r>
       <w:r>
-        <w:t xml:space="preserve"> 5. Author variable coefficients predicting citation counts and </w:t>
-      </w:r>
-      <w:proofErr w:type="gramStart"/>
-      <w:r>
-        <w:t>five year</w:t>
-      </w:r>
-      <w:proofErr w:type="gramEnd"/>
-      <w:r>
-        <w:t xml:space="preserve"> citation counts separated by subject area. 95% confidence intervals are displayed but are very narrow due to large sample size. Appendix A includes all exact values for reference.</w:t>
+        <w:t xml:space="preserve"> 5. Author variable coefficients predicting citation counts and five year citation counts separated by subject area. 95% confidence intervals are displayed but are very narrow due to large sample size. Appendix A includes all exact values for reference.</w:t>
       </w:r>
     </w:p>
     <w:p>
@@ -2527,15 +2269,7 @@
         <w:t>Figure</w:t>
       </w:r>
       <w:r>
-        <w:t xml:space="preserve"> 6. Author variable coefficients predicting citation counts and </w:t>
-      </w:r>
-      <w:proofErr w:type="gramStart"/>
-      <w:r>
-        <w:t>five year</w:t>
-      </w:r>
-      <w:proofErr w:type="gramEnd"/>
-      <w:r>
-        <w:t xml:space="preserve"> citation counts separated by subject area. 95% confidence intervals are displayed but are very narrow due to large sample size. Appendix A includes all exact values for reference.</w:t>
+        <w:t xml:space="preserve"> 6. Author variable coefficients predicting citation counts and five year citation counts separated by subject area. 95% confidence intervals are displayed but are very narrow due to large sample size. Appendix A includes all exact values for reference.</w:t>
       </w:r>
     </w:p>
     <w:p>
@@ -2574,15 +2308,7 @@
         <w:spacing w:before="0" w:after="0"/>
       </w:pPr>
       <w:r>
-        <w:t xml:space="preserve">The first research question in this paper addressed the pattern of team size distribution within various disciplines over time and the relationship between team size and article impact. Our findings indicate a consistent increase in team size across disciplines, corroborating previous research on the expansion of scientific collaboration (Larivière et al., 2015; </w:t>
-      </w:r>
-      <w:proofErr w:type="spellStart"/>
-      <w:r>
-        <w:t>Wuchty</w:t>
-      </w:r>
-      <w:proofErr w:type="spellEnd"/>
-      <w:r>
-        <w:t xml:space="preserve"> et al., 2007). </w:t>
+        <w:t xml:space="preserve">The first research question in this paper addressed the pattern of team size distribution within various disciplines over time and the relationship between team size and article impact. Our findings indicate a consistent increase in team size across disciplines, corroborating previous research on the expansion of scientific collaboration (Larivière et al., 2015; Wuchty et al., 2007). </w:t>
       </w:r>
       <w:r>
         <w:lastRenderedPageBreak/>
@@ -2628,15 +2354,7 @@
         <w:spacing w:before="0" w:after="0"/>
       </w:pPr>
       <w:r>
-        <w:t xml:space="preserve">Our analysis also confirms a positive association between team size and article impact, as measured by citation counts, reinforcing previous findings that collaborative works tend to garner more citations (Thijs et al., 2015; </w:t>
-      </w:r>
-      <w:proofErr w:type="spellStart"/>
-      <w:r>
-        <w:t>Wuchty</w:t>
-      </w:r>
-      <w:proofErr w:type="spellEnd"/>
-      <w:r>
-        <w:t xml:space="preserve"> et al., 2007). One potential explanation is the increased </w:t>
+        <w:t xml:space="preserve">Our analysis also confirms a positive association between team size and article impact, as measured by citation counts, reinforcing previous findings that collaborative works tend to garner more citations (Thijs et al., 2015; Wuchty et al., 2007). One potential explanation is the increased </w:t>
       </w:r>
       <w:r>
         <w:lastRenderedPageBreak/>
@@ -2694,15 +2412,7 @@
       </w:r>
       <w:r>
         <w:lastRenderedPageBreak/>
-        <w:t xml:space="preserve">with </w:t>
-      </w:r>
-      <w:proofErr w:type="gramStart"/>
-      <w:r>
-        <w:t>particular authorship</w:t>
-      </w:r>
-      <w:proofErr w:type="gramEnd"/>
-      <w:r>
-        <w:t xml:space="preserve"> positions. In all other instances, male-authored papers received more citations. This aligns with previous research that highlights the systematic devaluation of women’s peer-reviewed contributions and research that is considered </w:t>
+        <w:t xml:space="preserve">with particular authorship positions. In all other instances, male-authored papers received more citations. This aligns with previous research that highlights the systematic devaluation of women’s peer-reviewed contributions and research that is considered </w:t>
       </w:r>
       <w:r>
         <w:rPr>
@@ -2800,23 +2510,7 @@
         <w:t>h</w:t>
       </w:r>
       <w:r>
-        <w:t>-index and citation counts was evident across all disciplines, with stronger effects observed for last authors compared to first authors. This finding suggests that senior researchers with established publication records tend to attract more citations, potentially due to their reputation and extensive academic networks (Geraci et al., 2015). Interestingly, the relationship between h-index and citation count was more pronounced when self-citations were excluded, implying that high-impact researchers benefit from external validation rather than self-referential practices (</w:t>
-      </w:r>
-      <w:proofErr w:type="spellStart"/>
-      <w:r>
-        <w:t>Leimu</w:t>
-      </w:r>
-      <w:proofErr w:type="spellEnd"/>
-      <w:r>
-        <w:t xml:space="preserve"> &amp; </w:t>
-      </w:r>
-      <w:proofErr w:type="spellStart"/>
-      <w:r>
-        <w:t>Koricheva</w:t>
-      </w:r>
-      <w:proofErr w:type="spellEnd"/>
-      <w:r>
-        <w:t>, 2005). This highlights the importance of distinguishing between genuine academic influence and self-reinforcing citation behaviors when assessing scholarly impact. Additionally, scholars with higher h-indices may have greater access to institutional resources, mentorship opportunities, and visibility in high-impact journals, further compounding their influence on citation metrics. Future research should explore how variations in h-index across disciplines and career stages affect long-term scholarly impact.</w:t>
+        <w:t>-index and citation counts was evident across all disciplines, with stronger effects observed for last authors compared to first authors. This finding suggests that senior researchers with established publication records tend to attract more citations, potentially due to their reputation and extensive academic networks (Geraci et al., 2015). Interestingly, the relationship between h-index and citation count was more pronounced when self-citations were excluded, implying that high-impact researchers benefit from external validation rather than self-referential practices (Leimu &amp; Koricheva, 2005). This highlights the importance of distinguishing between genuine academic influence and self-reinforcing citation behaviors when assessing scholarly impact. Additionally, scholars with higher h-indices may have greater access to institutional resources, mentorship opportunities, and visibility in high-impact journals, further compounding their influence on citation metrics. Future research should explore how variations in h-index across disciplines and career stages affect long-term scholarly impact.</w:t>
       </w:r>
     </w:p>
     <w:p>
@@ -2919,41 +2613,22 @@
       <w:bookmarkStart w:id="39" w:name="ref-aust2022"/>
       <w:bookmarkEnd w:id="37"/>
       <w:r>
-        <w:t xml:space="preserve">Aust, F., Barth, M., </w:t>
-      </w:r>
-      <w:proofErr w:type="spellStart"/>
-      <w:r>
-        <w:t>Diedenhofen</w:t>
-      </w:r>
-      <w:proofErr w:type="spellEnd"/>
-      <w:r>
-        <w:t xml:space="preserve">, B., Stahl, C., Casillas, J. V., &amp; Siegel, R. (2022). </w:t>
-      </w:r>
-      <w:proofErr w:type="spellStart"/>
+        <w:t xml:space="preserve">Aust, F., Barth, M., Diedenhofen, B., Stahl, C., Casillas, J. V., &amp; Siegel, R. (2022). </w:t>
+      </w:r>
       <w:r>
         <w:rPr>
           <w:i/>
           <w:iCs/>
         </w:rPr>
-        <w:t>Papaja</w:t>
-      </w:r>
-      <w:proofErr w:type="spellEnd"/>
+        <w:t xml:space="preserve">Papaja: Prepare </w:t>
+      </w:r>
       <w:r>
         <w:rPr>
           <w:i/>
           <w:iCs/>
         </w:rPr>
-        <w:t xml:space="preserve">: Prepare </w:t>
-      </w:r>
-      <w:proofErr w:type="spellStart"/>
-      <w:r>
-        <w:rPr>
-          <w:i/>
-          <w:iCs/>
-        </w:rPr>
-        <w:t>american</w:t>
-      </w:r>
-      <w:proofErr w:type="spellEnd"/>
+        <w:t>American</w:t>
+      </w:r>
       <w:r>
         <w:rPr>
           <w:i/>
@@ -2981,62 +2656,14 @@
       <w:bookmarkStart w:id="40" w:name="ref-becker2021"/>
       <w:bookmarkEnd w:id="39"/>
       <w:r>
-        <w:t xml:space="preserve">Becker, J., Chan, C., Chan, G. C., Leeper, T. J., Gandrud, C., MacDonald, A., Zahn, I., </w:t>
-      </w:r>
-      <w:proofErr w:type="spellStart"/>
-      <w:r>
-        <w:t>Stadlmann</w:t>
-      </w:r>
-      <w:proofErr w:type="spellEnd"/>
-      <w:r>
-        <w:t xml:space="preserve">, S., Williamson, R., Kennedy, P., Price, R., Davis, T. L., Day, N., Denney, B., &amp; </w:t>
-      </w:r>
-      <w:proofErr w:type="spellStart"/>
-      <w:r>
-        <w:t>Bokov</w:t>
-      </w:r>
-      <w:proofErr w:type="spellEnd"/>
-      <w:r>
-        <w:t xml:space="preserve">, A. (2021). </w:t>
+        <w:t xml:space="preserve">Becker, J., Chan, C., Chan, G. C., Leeper, T. J., Gandrud, C., MacDonald, A., Zahn, I., Stadlmann, S., Williamson, R., Kennedy, P., Price, R., Davis, T. L., Day, N., Denney, B., &amp; Bokov, A. (2021). </w:t>
       </w:r>
       <w:r>
         <w:rPr>
           <w:i/>
           <w:iCs/>
         </w:rPr>
-        <w:t xml:space="preserve">Rio: A </w:t>
-      </w:r>
-      <w:proofErr w:type="spellStart"/>
-      <w:r>
-        <w:rPr>
-          <w:i/>
-          <w:iCs/>
-        </w:rPr>
-        <w:t>swiss</w:t>
-      </w:r>
-      <w:proofErr w:type="spellEnd"/>
-      <w:r>
-        <w:rPr>
-          <w:i/>
-          <w:iCs/>
-        </w:rPr>
-        <w:t xml:space="preserve">-army knife for data </w:t>
-      </w:r>
-      <w:proofErr w:type="spellStart"/>
-      <w:r>
-        <w:rPr>
-          <w:i/>
-          <w:iCs/>
-        </w:rPr>
-        <w:t>i</w:t>
-      </w:r>
-      <w:proofErr w:type="spellEnd"/>
-      <w:r>
-        <w:rPr>
-          <w:i/>
-          <w:iCs/>
-        </w:rPr>
-        <w:t>/o</w:t>
+        <w:t>Rio: A swiss-army knife for data i/o</w:t>
       </w:r>
       <w:r>
         <w:t xml:space="preserve">. </w:t>
@@ -3189,7 +2816,6 @@
       <w:r>
         <w:t xml:space="preserve">Cameron, E. Z., White, A. M., &amp; Gray, M. E. (2016). Solving the Productivity and Impact Puzzle: Do Men Outperform Women, or are Metrics Biased? </w:t>
       </w:r>
-      <w:proofErr w:type="spellStart"/>
       <w:r>
         <w:rPr>
           <w:i/>
@@ -3197,7 +2823,6 @@
         </w:rPr>
         <w:t>BioScience</w:t>
       </w:r>
-      <w:proofErr w:type="spellEnd"/>
       <w:r>
         <w:t xml:space="preserve">, </w:t>
       </w:r>
@@ -3227,45 +2852,15 @@
       </w:pPr>
       <w:bookmarkStart w:id="45" w:name="ref-champely2017"/>
       <w:bookmarkEnd w:id="44"/>
-      <w:proofErr w:type="spellStart"/>
-      <w:r>
-        <w:t>Champely</w:t>
-      </w:r>
-      <w:proofErr w:type="spellEnd"/>
-      <w:r>
-        <w:t xml:space="preserve">, S., Ekstrom, C., Dalgaard, P., Gill, J., </w:t>
-      </w:r>
-      <w:proofErr w:type="spellStart"/>
-      <w:r>
-        <w:t>Weibelzahl</w:t>
-      </w:r>
-      <w:proofErr w:type="spellEnd"/>
-      <w:r>
-        <w:t xml:space="preserve">, S., Anandkumar, A., Ford, C., </w:t>
-      </w:r>
-      <w:proofErr w:type="spellStart"/>
-      <w:r>
-        <w:t>Volcic</w:t>
-      </w:r>
-      <w:proofErr w:type="spellEnd"/>
-      <w:r>
-        <w:t xml:space="preserve">, R., &amp; De Rosario, H. (2017). </w:t>
-      </w:r>
-      <w:proofErr w:type="spellStart"/>
+      <w:r>
+        <w:t xml:space="preserve">Champely, S., Ekstrom, C., Dalgaard, P., Gill, J., Weibelzahl, S., Anandkumar, A., Ford, C., Volcic, R., &amp; De Rosario, H. (2017). </w:t>
+      </w:r>
       <w:r>
         <w:rPr>
           <w:i/>
           <w:iCs/>
         </w:rPr>
-        <w:t>Pwr</w:t>
-      </w:r>
-      <w:proofErr w:type="spellEnd"/>
-      <w:r>
-        <w:rPr>
-          <w:i/>
-          <w:iCs/>
-        </w:rPr>
-        <w:t>: Basic functions for power analysis</w:t>
+        <w:t>Pwr: Basic functions for power analysis</w:t>
       </w:r>
       <w:r>
         <w:t>.</w:t>
@@ -3282,7 +2877,6 @@
         <w:lastRenderedPageBreak/>
         <w:t xml:space="preserve">Coccia, M., &amp; Bozeman, B. (2016). Allometric models to measure and analyze the evolution of international research collaboration. </w:t>
       </w:r>
-      <w:proofErr w:type="spellStart"/>
       <w:r>
         <w:rPr>
           <w:i/>
@@ -3290,7 +2884,6 @@
         </w:rPr>
         <w:t>Scientometrics</w:t>
       </w:r>
-      <w:proofErr w:type="spellEnd"/>
       <w:r>
         <w:t xml:space="preserve">, </w:t>
       </w:r>
@@ -3469,15 +3062,7 @@
       <w:bookmarkStart w:id="51" w:name="ref-freeman2015"/>
       <w:bookmarkEnd w:id="50"/>
       <w:r>
-        <w:t xml:space="preserve">Freeman, R. B., &amp; Huang, W. (2015). Collaborating with People Like Me: Ethnic </w:t>
-      </w:r>
-      <w:proofErr w:type="spellStart"/>
-      <w:r>
-        <w:t>Coauthorship</w:t>
-      </w:r>
-      <w:proofErr w:type="spellEnd"/>
-      <w:r>
-        <w:t xml:space="preserve"> within the United States. </w:t>
+        <w:t xml:space="preserve">Freeman, R. B., &amp; Huang, W. (2015). Collaborating with People Like Me: Ethnic Coauthorship within the United States. </w:t>
       </w:r>
       <w:r>
         <w:rPr>
@@ -3567,7 +3152,6 @@
       <w:r>
         <w:t xml:space="preserve">Geraci, L., Balsis, S., &amp; Busch, A. J. B. (2015). Gender and the h index in psychology. </w:t>
       </w:r>
-      <w:proofErr w:type="spellStart"/>
       <w:r>
         <w:rPr>
           <w:i/>
@@ -3575,7 +3159,6 @@
         </w:rPr>
         <w:t>Scientometrics</w:t>
       </w:r>
-      <w:proofErr w:type="spellEnd"/>
       <w:r>
         <w:t xml:space="preserve">, </w:t>
       </w:r>
@@ -3646,7 +3229,6 @@
       <w:r>
         <w:t xml:space="preserve">2013). </w:t>
       </w:r>
-      <w:proofErr w:type="spellStart"/>
       <w:r>
         <w:rPr>
           <w:i/>
@@ -3654,7 +3236,6 @@
         </w:rPr>
         <w:t>Scientometrics</w:t>
       </w:r>
-      <w:proofErr w:type="spellEnd"/>
       <w:r>
         <w:t xml:space="preserve">, </w:t>
       </w:r>
@@ -3685,15 +3266,7 @@
       <w:bookmarkStart w:id="56" w:name="ref-hinnant2012"/>
       <w:bookmarkEnd w:id="55"/>
       <w:r>
-        <w:t xml:space="preserve">Hinnant, C. C., </w:t>
-      </w:r>
-      <w:proofErr w:type="spellStart"/>
-      <w:r>
-        <w:t>Stvilia</w:t>
-      </w:r>
-      <w:proofErr w:type="spellEnd"/>
-      <w:r>
-        <w:t xml:space="preserve">, B., Wu, S., Worrall, A., Burnett, G., Burnett, K., Kazmer, M. M., &amp; Marty, P. F. (2012). Author-team diversity and the impact of scientific publications: Evidence from physics research at a national science lab. </w:t>
+        <w:t xml:space="preserve">Hinnant, C. C., Stvilia, B., Wu, S., Worrall, A., Burnett, G., Burnett, K., Kazmer, M. M., &amp; Marty, P. F. (2012). Author-team diversity and the impact of scientific publications: Evidence from physics research at a national science lab. </w:t>
       </w:r>
       <w:r>
         <w:rPr>
@@ -3858,29 +3431,8 @@
       </w:pPr>
       <w:bookmarkStart w:id="60" w:name="ref-jagsi2006"/>
       <w:bookmarkEnd w:id="59"/>
-      <w:proofErr w:type="spellStart"/>
-      <w:r>
-        <w:t>Jagsi</w:t>
-      </w:r>
-      <w:proofErr w:type="spellEnd"/>
-      <w:r>
-        <w:t xml:space="preserve">, R., </w:t>
-      </w:r>
-      <w:proofErr w:type="spellStart"/>
-      <w:r>
-        <w:t>Guancial</w:t>
-      </w:r>
-      <w:proofErr w:type="spellEnd"/>
-      <w:r>
-        <w:t xml:space="preserve">, E. A., Worobey, C. C., Henault, L. E., Chang, Y., Starr, R., Tarbell, N. J., &amp; </w:t>
-      </w:r>
-      <w:proofErr w:type="spellStart"/>
-      <w:r>
-        <w:t>Hylek</w:t>
-      </w:r>
-      <w:proofErr w:type="spellEnd"/>
-      <w:r>
-        <w:t>, E. M. (2006). The “Gender Gap” in Authorship of Academic Medical Literature</w:t>
+      <w:r>
+        <w:t>Jagsi, R., Guancial, E. A., Worobey, C. C., Henault, L. E., Chang, Y., Starr, R., Tarbell, N. J., &amp; Hylek, E. M. (2006). The “Gender Gap” in Authorship of Academic Medical Literature</w:t>
       </w:r>
       <w:r>
         <w:t xml:space="preserve">: </w:t>
@@ -3927,7 +3479,6 @@
       <w:r>
         <w:t xml:space="preserve">Katz, J. S., &amp; Hicks, D. (1997). How much is a collaboration worth? A calibrated bibliometric model. </w:t>
       </w:r>
-      <w:proofErr w:type="spellStart"/>
       <w:r>
         <w:rPr>
           <w:i/>
@@ -3935,7 +3486,6 @@
         </w:rPr>
         <w:t>Scientometrics</w:t>
       </w:r>
-      <w:proofErr w:type="spellEnd"/>
       <w:r>
         <w:t xml:space="preserve">, </w:t>
       </w:r>
@@ -3976,15 +3526,7 @@
         <w:t>The wisdom of teams: Creating the high-performance organization</w:t>
       </w:r>
       <w:r>
-        <w:t xml:space="preserve">. </w:t>
-      </w:r>
-      <w:proofErr w:type="spellStart"/>
-      <w:r>
-        <w:t>HarperBusiness</w:t>
-      </w:r>
-      <w:proofErr w:type="spellEnd"/>
-      <w:r>
-        <w:t xml:space="preserve"> Essentials.</w:t>
+        <w:t>. HarperBusiness Essentials.</w:t>
       </w:r>
     </w:p>
     <w:p>
@@ -4027,7 +3569,6 @@
         <w:lastRenderedPageBreak/>
         <w:t xml:space="preserve">Khor, K. A., &amp; Yu, L.-G. (2016). Influence of international co-authorship on the research citation impact of young universities. </w:t>
       </w:r>
-      <w:proofErr w:type="spellStart"/>
       <w:r>
         <w:rPr>
           <w:i/>
@@ -4035,7 +3576,6 @@
         </w:rPr>
         <w:t>Scientometrics</w:t>
       </w:r>
-      <w:proofErr w:type="spellEnd"/>
       <w:r>
         <w:t xml:space="preserve">, </w:t>
       </w:r>
@@ -4068,7 +3608,6 @@
       <w:r>
         <w:t xml:space="preserve">Kliegl, R., &amp; Bates, D. (2011). International collaboration in psychology is on the rise. </w:t>
       </w:r>
-      <w:proofErr w:type="spellStart"/>
       <w:r>
         <w:rPr>
           <w:i/>
@@ -4076,7 +3615,6 @@
         </w:rPr>
         <w:t>Scientometrics</w:t>
       </w:r>
-      <w:proofErr w:type="spellEnd"/>
       <w:r>
         <w:t xml:space="preserve">, </w:t>
       </w:r>
@@ -4185,15 +3723,7 @@
       <w:bookmarkStart w:id="68" w:name="ref-leifeld2017"/>
       <w:bookmarkEnd w:id="67"/>
       <w:r>
-        <w:t xml:space="preserve">Leifeld, P., </w:t>
-      </w:r>
-      <w:proofErr w:type="spellStart"/>
-      <w:r>
-        <w:t>Wankmüller</w:t>
-      </w:r>
-      <w:proofErr w:type="spellEnd"/>
-      <w:r>
-        <w:t xml:space="preserve">, S., Berger, V. T. Z., Ingold, K., &amp; Steiner, C. (2017). Collaboration patterns in the German political science co-authorship network. </w:t>
+        <w:t xml:space="preserve">Leifeld, P., Wankmüller, S., Berger, V. T. Z., Ingold, K., &amp; Steiner, C. (2017). Collaboration patterns in the German political science co-authorship network. </w:t>
       </w:r>
       <w:r>
         <w:rPr>
@@ -4231,21 +3761,8 @@
       </w:pPr>
       <w:bookmarkStart w:id="69" w:name="ref-leimu2005"/>
       <w:bookmarkEnd w:id="68"/>
-      <w:proofErr w:type="spellStart"/>
-      <w:r>
-        <w:t>Leimu</w:t>
-      </w:r>
-      <w:proofErr w:type="spellEnd"/>
-      <w:r>
-        <w:t xml:space="preserve">, R., &amp; </w:t>
-      </w:r>
-      <w:proofErr w:type="spellStart"/>
-      <w:r>
-        <w:t>Koricheva</w:t>
-      </w:r>
-      <w:proofErr w:type="spellEnd"/>
-      <w:r>
-        <w:t xml:space="preserve">, J. (2005). What determines the citation frequency of ecological papers? </w:t>
+      <w:r>
+        <w:t xml:space="preserve">Leimu, R., &amp; Koricheva, J. (2005). What determines the citation frequency of ecological papers? </w:t>
       </w:r>
       <w:r>
         <w:rPr>
@@ -4323,15 +3840,7 @@
       <w:bookmarkStart w:id="71" w:name="ref-mihaljevic-brandt2016"/>
       <w:bookmarkEnd w:id="70"/>
       <w:r>
-        <w:t xml:space="preserve">Mihaljević-Brandt, H., Santamaría, L., &amp; </w:t>
-      </w:r>
-      <w:proofErr w:type="spellStart"/>
-      <w:r>
-        <w:t>Tullney</w:t>
-      </w:r>
-      <w:proofErr w:type="spellEnd"/>
-      <w:r>
-        <w:t xml:space="preserve">, M. (2016). The Effect of Gender in the Publication Patterns in Mathematics. </w:t>
+        <w:t xml:space="preserve">Mihaljević-Brandt, H., Santamaría, L., &amp; Tullney, M. (2016). The Effect of Gender in the Publication Patterns in Mathematics. </w:t>
       </w:r>
       <w:r>
         <w:rPr>
@@ -4373,13 +3882,11 @@
         <w:lastRenderedPageBreak/>
         <w:t xml:space="preserve">Mirin, A. A. (2021). Gender disparity in the funding of diseases by the </w:t>
       </w:r>
-      <w:proofErr w:type="spellStart"/>
-      <w:r>
-        <w:t>u.s.</w:t>
-      </w:r>
-      <w:proofErr w:type="spellEnd"/>
-      <w:r>
-        <w:t xml:space="preserve"> National institutes of health. </w:t>
+      <w:r>
+        <w:t>U.S</w:t>
+      </w:r>
+      <w:r>
+        <w:t xml:space="preserve">. National institutes of health. </w:t>
       </w:r>
       <w:r>
         <w:rPr>
@@ -4418,25 +3925,8 @@
       <w:bookmarkStart w:id="73" w:name="ref-nabout2015"/>
       <w:bookmarkEnd w:id="72"/>
       <w:r>
-        <w:t xml:space="preserve">Nabout, J. C., Parreira, M. R., Teresa, F. B., Carneiro, F. M., Cunha, H. F. da, Souza </w:t>
-      </w:r>
-      <w:proofErr w:type="spellStart"/>
-      <w:r>
-        <w:t>Ondei</w:t>
-      </w:r>
-      <w:proofErr w:type="spellEnd"/>
-      <w:r>
-        <w:t xml:space="preserve">, L. de, </w:t>
-      </w:r>
-      <w:proofErr w:type="spellStart"/>
-      <w:r>
-        <w:t>Caramori</w:t>
-      </w:r>
-      <w:proofErr w:type="spellEnd"/>
-      <w:r>
-        <w:t xml:space="preserve">, S. S., &amp; Soares, T. N. (2015). Publish (in a group) or perish (alone): the trend from single- to multi-authorship in biological papers. </w:t>
-      </w:r>
-      <w:proofErr w:type="spellStart"/>
+        <w:t xml:space="preserve">Nabout, J. C., Parreira, M. R., Teresa, F. B., Carneiro, F. M., Cunha, H. F. da, Souza Ondei, L. de, Caramori, S. S., &amp; Soares, T. N. (2015). Publish (in a group) or perish (alone): the trend from single- to multi-authorship in biological papers. </w:t>
+      </w:r>
       <w:r>
         <w:rPr>
           <w:i/>
@@ -4444,7 +3934,6 @@
         </w:rPr>
         <w:t>Scientometrics</w:t>
       </w:r>
-      <w:proofErr w:type="spellEnd"/>
       <w:r>
         <w:t xml:space="preserve">, </w:t>
       </w:r>
@@ -4516,7 +4005,6 @@
       <w:r>
         <w:t xml:space="preserve">Nichols, L. G. (2014). A topic model approach to measuring interdisciplinarity at the National Science Foundation. </w:t>
       </w:r>
-      <w:proofErr w:type="spellStart"/>
       <w:r>
         <w:rPr>
           <w:i/>
@@ -4524,7 +4012,6 @@
         </w:rPr>
         <w:t>Scientometrics</w:t>
       </w:r>
-      <w:proofErr w:type="spellEnd"/>
       <w:r>
         <w:t xml:space="preserve">, </w:t>
       </w:r>
@@ -4564,7 +4051,6 @@
         </w:rPr>
         <w:t xml:space="preserve">Journal of Peace </w:t>
       </w:r>
-      <w:proofErr w:type="gramStart"/>
       <w:r>
         <w:rPr>
           <w:i/>
@@ -4573,9 +4059,8 @@
         <w:t>Research</w:t>
       </w:r>
       <w:r>
-        <w:t xml:space="preserve"> ,</w:t>
-      </w:r>
-      <w:proofErr w:type="gramEnd"/>
+        <w:t>,</w:t>
+      </w:r>
       <w:r>
         <w:t xml:space="preserve"> 1983-2008. </w:t>
       </w:r>
@@ -4616,15 +4101,7 @@
       <w:bookmarkStart w:id="77" w:name="ref-papatheodorou2008"/>
       <w:bookmarkEnd w:id="76"/>
       <w:r>
-        <w:t xml:space="preserve">Papatheodorou, S. I., </w:t>
-      </w:r>
-      <w:proofErr w:type="spellStart"/>
-      <w:r>
-        <w:t>Trikalinos</w:t>
-      </w:r>
-      <w:proofErr w:type="spellEnd"/>
-      <w:r>
-        <w:t xml:space="preserve">, T. A., &amp; Ioannidis, J. P. A. (2008). Inflated numbers of authors over time have not been just due to increasing research complexity. </w:t>
+        <w:t xml:space="preserve">Papatheodorou, S. I., Trikalinos, T. A., &amp; Ioannidis, J. P. A. (2008). Inflated numbers of authors over time have not been just due to increasing research complexity. </w:t>
       </w:r>
       <w:r>
         <w:rPr>
@@ -4663,15 +4140,7 @@
       <w:bookmarkStart w:id="78" w:name="ref-paul-hus2020"/>
       <w:bookmarkEnd w:id="77"/>
       <w:r>
-        <w:t xml:space="preserve">Paul-Hus, A., Mongeon, P., Sainte-Marie, M., &amp; Larivière, V. (2020). Who are the </w:t>
-      </w:r>
-      <w:proofErr w:type="spellStart"/>
-      <w:r>
-        <w:t>acknowledgees</w:t>
-      </w:r>
-      <w:proofErr w:type="spellEnd"/>
-      <w:r>
-        <w:t xml:space="preserve">? An analysis of gender and academic status. </w:t>
+        <w:t xml:space="preserve">Paul-Hus, A., Mongeon, P., Sainte-Marie, M., &amp; Larivière, V. (2020). Who are the acknowledgees? An analysis of gender and academic status. </w:t>
       </w:r>
       <w:r>
         <w:rPr>
@@ -4738,38 +4207,13 @@
       </w:pPr>
       <w:bookmarkStart w:id="80" w:name="ref-pyspark"/>
       <w:bookmarkEnd w:id="79"/>
-      <w:proofErr w:type="spellStart"/>
       <w:r>
         <w:rPr>
           <w:i/>
           <w:iCs/>
         </w:rPr>
         <w:lastRenderedPageBreak/>
-        <w:t>PySpark</w:t>
-      </w:r>
-      <w:proofErr w:type="spellEnd"/>
-      <w:r>
-        <w:rPr>
-          <w:i/>
-          <w:iCs/>
-        </w:rPr>
-        <w:t xml:space="preserve"> documentation </w:t>
-      </w:r>
-      <w:proofErr w:type="spellStart"/>
-      <w:r>
-        <w:rPr>
-          <w:i/>
-          <w:iCs/>
-        </w:rPr>
-        <w:t>PySpark</w:t>
-      </w:r>
-      <w:proofErr w:type="spellEnd"/>
-      <w:r>
-        <w:rPr>
-          <w:i/>
-          <w:iCs/>
-        </w:rPr>
-        <w:t xml:space="preserve"> 3.3.0 documentation</w:t>
+        <w:t>PySpark documentation PySpark 3.3.0 documentation</w:t>
       </w:r>
       <w:r>
         <w:t xml:space="preserve">. (n.d.). </w:t>
@@ -4820,15 +4264,7 @@
       <w:bookmarkStart w:id="82" w:name="ref-rath2016"/>
       <w:bookmarkEnd w:id="81"/>
       <w:r>
-        <w:t xml:space="preserve">Rath, K., &amp; Wohlrabe, K. (2016). Recent trends in co-authorship in economics: evidence from </w:t>
-      </w:r>
-      <w:proofErr w:type="spellStart"/>
-      <w:r>
-        <w:t>RePEc</w:t>
-      </w:r>
-      <w:proofErr w:type="spellEnd"/>
-      <w:r>
-        <w:t xml:space="preserve">. </w:t>
+        <w:t xml:space="preserve">Rath, K., &amp; Wohlrabe, K. (2016). Recent trends in co-authorship in economics: evidence from RePEc. </w:t>
       </w:r>
       <w:r>
         <w:rPr>
@@ -4867,15 +4303,7 @@
       <w:bookmarkStart w:id="83" w:name="ref-rezek2011"/>
       <w:bookmarkEnd w:id="82"/>
       <w:r>
-        <w:t xml:space="preserve">Rezek, I., McDonald, R. J., &amp; </w:t>
-      </w:r>
-      <w:proofErr w:type="spellStart"/>
-      <w:r>
-        <w:t>Kallmes</w:t>
-      </w:r>
-      <w:proofErr w:type="spellEnd"/>
-      <w:r>
-        <w:t xml:space="preserve">, D. F. (2011). Is the h-index predictive of greater NIH funding success among academic radiologists? </w:t>
+        <w:t xml:space="preserve">Rezek, I., McDonald, R. J., &amp; Kallmes, D. F. (2011). Is the h-index predictive of greater NIH funding success among academic radiologists? </w:t>
       </w:r>
       <w:r>
         <w:rPr>
@@ -4914,15 +4342,7 @@
       <w:bookmarkStart w:id="84" w:name="ref-rigg2012"/>
       <w:bookmarkEnd w:id="83"/>
       <w:r>
-        <w:t xml:space="preserve">Rigg, L. S., McCarragher, S., &amp; </w:t>
-      </w:r>
-      <w:proofErr w:type="spellStart"/>
-      <w:r>
-        <w:t>Krmenec</w:t>
-      </w:r>
-      <w:proofErr w:type="spellEnd"/>
-      <w:r>
-        <w:t xml:space="preserve">, A. (2012). Authorship, Collaboration, and Gender: Fifteen Years of Publication Productivity in Selected Geography Journals. </w:t>
+        <w:t xml:space="preserve">Rigg, L. S., McCarragher, S., &amp; Krmenec, A. (2012). Authorship, Collaboration, and Gender: Fifteen Years of Publication Productivity in Selected Geography Journals. </w:t>
       </w:r>
       <w:r>
         <w:rPr>
@@ -4961,15 +4381,7 @@
       <w:bookmarkStart w:id="85" w:name="ref-ross2022"/>
       <w:bookmarkEnd w:id="84"/>
       <w:r>
-        <w:t xml:space="preserve">Ross, M. B., Glennon, B. M., </w:t>
-      </w:r>
-      <w:proofErr w:type="spellStart"/>
-      <w:r>
-        <w:t>Murciano-Goroff</w:t>
-      </w:r>
-      <w:proofErr w:type="spellEnd"/>
-      <w:r>
-        <w:t xml:space="preserve">, R., Berkes, E. G., Weinberg, B. A., &amp; Lane, J. I. (2022). Women are Credited Less in Science than are Men. </w:t>
+        <w:t xml:space="preserve">Ross, M. B., Glennon, B. M., Murciano-Goroff, R., Berkes, E. G., Weinberg, B. A., &amp; Lane, J. I. (2022). Women are Credited Less in Science than are Men. </w:t>
       </w:r>
       <w:r>
         <w:rPr>
@@ -5118,7 +4530,6 @@
       <w:r>
         <w:t xml:space="preserve">Sharma, K. (2021). Team size and retracted citations reveal the patterns of retractions from 1981 to 2020. </w:t>
       </w:r>
-      <w:proofErr w:type="spellStart"/>
       <w:r>
         <w:rPr>
           <w:i/>
@@ -5126,7 +4537,6 @@
         </w:rPr>
         <w:t>Scientometrics</w:t>
       </w:r>
-      <w:proofErr w:type="spellEnd"/>
       <w:r>
         <w:t xml:space="preserve">, </w:t>
       </w:r>
@@ -5156,21 +4566,8 @@
       </w:pPr>
       <w:bookmarkStart w:id="90" w:name="ref-süßenbacher2017"/>
       <w:bookmarkEnd w:id="89"/>
-      <w:proofErr w:type="spellStart"/>
-      <w:r>
-        <w:t>Süßenbacher</w:t>
-      </w:r>
-      <w:proofErr w:type="spellEnd"/>
-      <w:r>
-        <w:t xml:space="preserve">, S., </w:t>
-      </w:r>
-      <w:proofErr w:type="spellStart"/>
-      <w:r>
-        <w:t>Amering</w:t>
-      </w:r>
-      <w:proofErr w:type="spellEnd"/>
-      <w:r>
-        <w:t xml:space="preserve">, M., Gmeiner, A., &amp; Schrank, B. (2017). Gender-gaps and glass ceilings: A survey of gender-specific publication trends in Psychiatry between 1994 and 2014. </w:t>
+      <w:r>
+        <w:t xml:space="preserve">Süßenbacher, S., Amering, M., Gmeiner, A., &amp; Schrank, B. (2017). Gender-gaps and glass ceilings: A survey of gender-specific publication trends in Psychiatry between 1994 and 2014. </w:t>
       </w:r>
       <w:r>
         <w:rPr>
@@ -5209,15 +4606,7 @@
       <w:bookmarkStart w:id="91" w:name="ref-thijs2015"/>
       <w:bookmarkEnd w:id="90"/>
       <w:r>
-        <w:t xml:space="preserve">Thijs, B., Costas, R., &amp; </w:t>
-      </w:r>
-      <w:proofErr w:type="spellStart"/>
-      <w:r>
-        <w:t>Glänzel</w:t>
-      </w:r>
-      <w:proofErr w:type="spellEnd"/>
-      <w:r>
-        <w:t xml:space="preserve">, W. (2015). </w:t>
+        <w:t xml:space="preserve">Thijs, B., Costas, R., &amp; Glänzel, W. (2015). </w:t>
       </w:r>
       <w:r>
         <w:rPr>
@@ -5285,17 +4674,8 @@
       <w:bookmarkStart w:id="93" w:name="ref-wang2015"/>
       <w:bookmarkEnd w:id="92"/>
       <w:r>
-        <w:t xml:space="preserve">Wang, L., Thijs, B., &amp; </w:t>
-      </w:r>
-      <w:proofErr w:type="spellStart"/>
-      <w:r>
-        <w:t>Glänzel</w:t>
-      </w:r>
-      <w:proofErr w:type="spellEnd"/>
-      <w:r>
-        <w:t xml:space="preserve">, W. (2015). Characteristics of international collaboration in sport sciences publications and its influence on citation impact. </w:t>
-      </w:r>
-      <w:proofErr w:type="spellStart"/>
+        <w:t xml:space="preserve">Wang, L., Thijs, B., &amp; Glänzel, W. (2015). Characteristics of international collaboration in sport sciences publications and its influence on citation impact. </w:t>
+      </w:r>
       <w:r>
         <w:rPr>
           <w:i/>
@@ -5303,7 +4683,6 @@
         </w:rPr>
         <w:t>Scientometrics</w:t>
       </w:r>
-      <w:proofErr w:type="spellEnd"/>
       <w:r>
         <w:t xml:space="preserve">, </w:t>
       </w:r>
@@ -5375,21 +4754,12 @@
       <w:r>
         <w:t xml:space="preserve">West, J. D., Jacquet, J., King, M. M., Correll, S. J., &amp; Bergstrom, C. T. (2013). The Role of Gender in Scholarly Authorship. </w:t>
       </w:r>
-      <w:proofErr w:type="spellStart"/>
       <w:r>
         <w:rPr>
           <w:i/>
           <w:iCs/>
         </w:rPr>
-        <w:t>PLoS</w:t>
-      </w:r>
-      <w:proofErr w:type="spellEnd"/>
-      <w:r>
-        <w:rPr>
-          <w:i/>
-          <w:iCs/>
-        </w:rPr>
-        <w:t xml:space="preserve"> ONE</w:t>
+        <w:t>PLoS ONE</w:t>
       </w:r>
       <w:r>
         <w:t xml:space="preserve">, </w:t>
@@ -5453,37 +4823,12 @@
         <w:lastRenderedPageBreak/>
         <w:t xml:space="preserve">Wickham, H. (2020). </w:t>
       </w:r>
-      <w:proofErr w:type="spellStart"/>
       <w:r>
         <w:rPr>
           <w:i/>
           <w:iCs/>
         </w:rPr>
-        <w:t>Tidyr</w:t>
-      </w:r>
-      <w:proofErr w:type="spellEnd"/>
-      <w:r>
-        <w:rPr>
-          <w:i/>
-          <w:iCs/>
-        </w:rPr>
-        <w:t xml:space="preserve">: </w:t>
-      </w:r>
-      <w:proofErr w:type="gramStart"/>
-      <w:r>
-        <w:rPr>
-          <w:i/>
-          <w:iCs/>
-        </w:rPr>
-        <w:t>Tidy messy</w:t>
-      </w:r>
-      <w:proofErr w:type="gramEnd"/>
-      <w:r>
-        <w:rPr>
-          <w:i/>
-          <w:iCs/>
-        </w:rPr>
-        <w:t xml:space="preserve"> data</w:t>
+        <w:t>Tidyr: Tidy messy data</w:t>
       </w:r>
       <w:r>
         <w:t xml:space="preserve">. </w:t>
@@ -5507,21 +4852,12 @@
       <w:r>
         <w:t xml:space="preserve">Wickham, H., François, R., Henry, L., &amp; Kirill Müller. (2020). </w:t>
       </w:r>
-      <w:proofErr w:type="spellStart"/>
       <w:r>
         <w:rPr>
           <w:i/>
           <w:iCs/>
         </w:rPr>
-        <w:t>Dplyr</w:t>
-      </w:r>
-      <w:proofErr w:type="spellEnd"/>
-      <w:r>
-        <w:rPr>
-          <w:i/>
-          <w:iCs/>
-        </w:rPr>
-        <w:t>: A grammar of data manipulation</w:t>
+        <w:t>Dplyr: A grammar of data manipulation</w:t>
       </w:r>
       <w:r>
         <w:t xml:space="preserve">. </w:t>
@@ -5542,13 +4878,8 @@
       </w:pPr>
       <w:bookmarkStart w:id="99" w:name="ref-wuchty2007"/>
       <w:bookmarkEnd w:id="98"/>
-      <w:proofErr w:type="spellStart"/>
-      <w:r>
-        <w:t>Wuchty</w:t>
-      </w:r>
-      <w:proofErr w:type="spellEnd"/>
-      <w:r>
-        <w:t xml:space="preserve">, S., Jones, B. F., &amp; Uzzi, B. (2007). The increasing dominance of teams in production of knowledge. </w:t>
+      <w:r>
+        <w:t xml:space="preserve">Wuchty, S., Jones, B. F., &amp; Uzzi, B. (2007). The increasing dominance of teams in production of knowledge. </w:t>
       </w:r>
       <w:r>
         <w:rPr>
@@ -5586,38 +4917,15 @@
       </w:pPr>
       <w:bookmarkStart w:id="100" w:name="ref-zafrunnishan.reddyv.p.2010"/>
       <w:bookmarkEnd w:id="99"/>
-      <w:proofErr w:type="spellStart"/>
-      <w:r>
-        <w:t>Zafrunnisha</w:t>
-      </w:r>
-      <w:proofErr w:type="spellEnd"/>
-      <w:r>
-        <w:t xml:space="preserve">, N., &amp; Reddy, V. P. (2010). </w:t>
+      <w:r>
+        <w:t xml:space="preserve">Zafrunnisha, N., &amp; Reddy, V. P. (2010). </w:t>
       </w:r>
       <w:r>
         <w:rPr>
           <w:i/>
           <w:iCs/>
         </w:rPr>
-        <w:t xml:space="preserve">Citation analysis of </w:t>
-      </w:r>
-      <w:proofErr w:type="spellStart"/>
-      <w:proofErr w:type="gramStart"/>
-      <w:r>
-        <w:rPr>
-          <w:i/>
-          <w:iCs/>
-        </w:rPr>
-        <w:t>ph.d</w:t>
-      </w:r>
-      <w:proofErr w:type="spellEnd"/>
-      <w:proofErr w:type="gramEnd"/>
-      <w:r>
-        <w:rPr>
-          <w:i/>
-          <w:iCs/>
-        </w:rPr>
-        <w:t xml:space="preserve"> theses in psychology: A quantitative analysis</w:t>
+        <w:t>Citation analysis of ph.d theses in psychology: A quantitative analysis</w:t>
       </w:r>
       <w:r>
         <w:t xml:space="preserve">. </w:t>
@@ -5639,15 +4947,7 @@
       <w:bookmarkStart w:id="101" w:name="ref-zeng2016"/>
       <w:bookmarkEnd w:id="100"/>
       <w:r>
-        <w:t xml:space="preserve">Zeng, X. H. T., Duch, J., Sales-Pardo, M., Moreira, J. A. G., </w:t>
-      </w:r>
-      <w:proofErr w:type="spellStart"/>
-      <w:r>
-        <w:t>Radicchi</w:t>
-      </w:r>
-      <w:proofErr w:type="spellEnd"/>
-      <w:r>
-        <w:t xml:space="preserve">, F., Ribeiro, H. V., Woodruff, T. K., &amp; Amaral, L. A. N. (2016). Differences in Collaboration Patterns across Discipline, Career Stage, and Gender. </w:t>
+        <w:t xml:space="preserve">Zeng, X. H. T., Duch, J., Sales-Pardo, M., Moreira, J. A. G., Radicchi, F., Ribeiro, H. V., Woodruff, T. K., &amp; Amaral, L. A. N. (2016). Differences in Collaboration Patterns across Discipline, Career Stage, and Gender. </w:t>
       </w:r>
       <w:r>
         <w:rPr>
@@ -5775,20 +5075,15 @@
       <w:r>
         <w:t xml:space="preserve">By searching for </w:t>
       </w:r>
-      <w:proofErr w:type="spellStart"/>
-      <w:proofErr w:type="gramStart"/>
       <w:r>
         <w:rPr>
           <w:rStyle w:val="VerbatimChar"/>
         </w:rPr>
         <w:t>stat.corr</w:t>
       </w:r>
-      <w:proofErr w:type="spellEnd"/>
-      <w:proofErr w:type="gramEnd"/>
       <w:r>
         <w:t xml:space="preserve"> within the code, you can find the correlations with there are multiple independent variables within a regression analysis. They are usually printed at the bottom of a scatter plot. The correlations for research question 1 were all very low </w:t>
       </w:r>
-      <w:proofErr w:type="spellStart"/>
       <w:r>
         <w:rPr>
           <w:i/>
@@ -5797,11 +5092,7 @@
         <w:t>r</w:t>
       </w:r>
       <w:r>
-        <w:t>s</w:t>
-      </w:r>
-      <w:proofErr w:type="spellEnd"/>
-      <w:r>
-        <w:t xml:space="preserve"> from .02 to .30. The correlations for research question 2 were similarly low with two exceptions: </w:t>
+        <w:t xml:space="preserve">s from .02 to .30. The correlations for research question 2 were similarly low with two exceptions: </w:t>
       </w:r>
       <w:r>
         <w:rPr>
@@ -5831,15 +5122,7 @@
         <w:t>r</w:t>
       </w:r>
       <w:r>
-        <w:t xml:space="preserve"> &gt; .90 overall. Institution </w:t>
-      </w:r>
-      <w:proofErr w:type="gramStart"/>
-      <w:r>
-        <w:t>count</w:t>
-      </w:r>
-      <w:proofErr w:type="gramEnd"/>
-      <w:r>
-        <w:t xml:space="preserve"> for Earth Sciences correlated with team size at </w:t>
+        <w:t xml:space="preserve"> &gt; .90 overall. Institution count for Earth Sciences correlated with team size at </w:t>
       </w:r>
       <w:r>
         <w:rPr>

</xml_diff>